<commit_message>
Added modal response in analyst
</commit_message>
<xml_diff>
--- a/AnalystAgentForTS.docx
+++ b/AnalystAgentForTS.docx
@@ -749,6 +749,36 @@
     </w:p>
     <w:p/>
     <w:p>
+      <w:r>
+        <w:t>There are two components as part of the analyst agent, each can be used independently:</w:t>
+      </w:r>
+    </w:p>
+    <w:p>
+      <w:pPr>
+        <w:pStyle w:val="ListParagraph"/>
+        <w:numPr>
+          <w:ilvl w:val="0"/>
+          <w:numId w:val="21"/>
+        </w:numPr>
+      </w:pPr>
+      <w:r>
+        <w:t>Data analyst</w:t>
+      </w:r>
+    </w:p>
+    <w:p>
+      <w:pPr>
+        <w:pStyle w:val="ListParagraph"/>
+        <w:numPr>
+          <w:ilvl w:val="0"/>
+          <w:numId w:val="21"/>
+        </w:numPr>
+      </w:pPr>
+      <w:r>
+        <w:t xml:space="preserve">Presenter </w:t>
+      </w:r>
+    </w:p>
+    <w:p/>
+    <w:p>
       <w:pPr>
         <w:rPr>
           <w:b/>
@@ -770,7 +800,6 @@
       </w:r>
     </w:p>
     <w:p/>
-    <w:p/>
     <w:p>
       <w:pPr>
         <w:rPr>
@@ -789,7 +818,193 @@
           <w:sz w:val="32"/>
           <w:szCs w:val="32"/>
         </w:rPr>
-        <w:t>Getting a sense of latency:</w:t>
+        <w:t>Response</w:t>
+      </w:r>
+    </w:p>
+    <w:p>
+      <w:r>
+        <w:t xml:space="preserve">The analyst agent always produces a structured response combining: </w:t>
+      </w:r>
+    </w:p>
+    <w:p>
+      <w:pPr>
+        <w:pStyle w:val="ListParagraph"/>
+      </w:pPr>
+    </w:p>
+    <w:p>
+      <w:pPr>
+        <w:pStyle w:val="ListParagraph"/>
+        <w:numPr>
+          <w:ilvl w:val="0"/>
+          <w:numId w:val="20"/>
+        </w:numPr>
+      </w:pPr>
+      <w:r>
+        <w:t xml:space="preserve">Text </w:t>
+      </w:r>
+    </w:p>
+    <w:p>
+      <w:pPr>
+        <w:pStyle w:val="ListParagraph"/>
+        <w:numPr>
+          <w:ilvl w:val="0"/>
+          <w:numId w:val="20"/>
+        </w:numPr>
+      </w:pPr>
+      <w:r>
+        <w:t>Tables</w:t>
+      </w:r>
+    </w:p>
+    <w:p>
+      <w:pPr>
+        <w:pStyle w:val="ListParagraph"/>
+        <w:numPr>
+          <w:ilvl w:val="0"/>
+          <w:numId w:val="20"/>
+        </w:numPr>
+      </w:pPr>
+      <w:r>
+        <w:t>A clarification question</w:t>
+      </w:r>
+    </w:p>
+    <w:p>
+      <w:pPr>
+        <w:pStyle w:val="ListParagraph"/>
+      </w:pPr>
+    </w:p>
+    <w:p>
+      <w:r>
+        <w:t xml:space="preserve">The presenter, if attached, can produce one or more interactive charts from tables received from the analyst. </w:t>
+      </w:r>
+    </w:p>
+    <w:p/>
+    <w:p>
+      <w:pPr>
+        <w:pStyle w:val="ListParagraph"/>
+        <w:numPr>
+          <w:ilvl w:val="0"/>
+          <w:numId w:val="22"/>
+        </w:numPr>
+      </w:pPr>
+      <w:r>
+        <w:t>Charts + Tables</w:t>
+      </w:r>
+    </w:p>
+    <w:p/>
+    <w:p>
+      <w:r>
+        <w:t xml:space="preserve">Textual responses and questions produced from the analyst are not reformatted but just passed directly to the output of the presenter. </w:t>
+      </w:r>
+    </w:p>
+    <w:p>
+      <w:pPr>
+        <w:rPr>
+          <w:b/>
+          <w:bCs/>
+          <w:color w:val="0014DC" w:themeColor="accent1"/>
+          <w:sz w:val="32"/>
+          <w:szCs w:val="32"/>
+        </w:rPr>
+      </w:pPr>
+    </w:p>
+    <w:p>
+      <w:pPr>
+        <w:rPr>
+          <w:b/>
+          <w:bCs/>
+          <w:color w:val="0014DC" w:themeColor="accent1"/>
+          <w:sz w:val="32"/>
+          <w:szCs w:val="32"/>
+        </w:rPr>
+      </w:pPr>
+    </w:p>
+    <w:p>
+      <w:pPr>
+        <w:rPr>
+          <w:b/>
+          <w:bCs/>
+          <w:color w:val="0014DC" w:themeColor="accent1"/>
+          <w:sz w:val="32"/>
+          <w:szCs w:val="32"/>
+        </w:rPr>
+      </w:pPr>
+    </w:p>
+    <w:p>
+      <w:pPr>
+        <w:rPr>
+          <w:b/>
+          <w:bCs/>
+          <w:color w:val="0014DC" w:themeColor="accent1"/>
+          <w:sz w:val="32"/>
+          <w:szCs w:val="32"/>
+        </w:rPr>
+      </w:pPr>
+    </w:p>
+    <w:p>
+      <w:pPr>
+        <w:rPr>
+          <w:b/>
+          <w:bCs/>
+          <w:color w:val="0014DC" w:themeColor="accent1"/>
+          <w:sz w:val="32"/>
+          <w:szCs w:val="32"/>
+        </w:rPr>
+      </w:pPr>
+    </w:p>
+    <w:p>
+      <w:pPr>
+        <w:rPr>
+          <w:b/>
+          <w:bCs/>
+          <w:color w:val="0014DC" w:themeColor="accent1"/>
+          <w:sz w:val="32"/>
+          <w:szCs w:val="32"/>
+        </w:rPr>
+      </w:pPr>
+      <w:proofErr w:type="spellStart"/>
+      <w:r>
+        <w:rPr>
+          <w:b/>
+          <w:bCs/>
+          <w:color w:val="0014DC" w:themeColor="accent1"/>
+          <w:sz w:val="32"/>
+          <w:szCs w:val="32"/>
+        </w:rPr>
+        <w:t>TRhe</w:t>
+      </w:r>
+      <w:proofErr w:type="spellEnd"/>
+    </w:p>
+    <w:p/>
+    <w:p/>
+    <w:p>
+      <w:pPr>
+        <w:rPr>
+          <w:b/>
+          <w:bCs/>
+          <w:color w:val="0014DC" w:themeColor="accent1"/>
+          <w:sz w:val="32"/>
+          <w:szCs w:val="32"/>
+        </w:rPr>
+      </w:pPr>
+      <w:r>
+        <w:rPr>
+          <w:b/>
+          <w:bCs/>
+          <w:color w:val="0014DC" w:themeColor="accent1"/>
+          <w:sz w:val="32"/>
+          <w:szCs w:val="32"/>
+        </w:rPr>
+        <w:t>Estimate of time-to-response in comparison to base</w:t>
+      </w:r>
+      <w:r>
+        <w:rPr>
+          <w:b/>
+          <w:bCs/>
+          <w:color w:val="0014DC" w:themeColor="accent1"/>
+          <w:sz w:val="32"/>
+          <w:szCs w:val="32"/>
+        </w:rPr>
+        <w:t xml:space="preserve"> latency:</w:t>
       </w:r>
     </w:p>
     <w:p>
@@ -975,10 +1190,26 @@
         <w:t>The table above compares the time to response for two queries. The first one is considered trivial. It requires not tool calls, agents or any cognitive load. We take the time reported (10 seconds) as the latency. The response for a more complex query could be 5 times longer. Note that latency varies during the day</w:t>
       </w:r>
       <w:r>
-        <w:t xml:space="preserve">. It could be as low as 0.4 seconds. Yet </w:t>
+        <w:t xml:space="preserve">. It could be as low as 0.4 seconds. </w:t>
+      </w:r>
+      <w:proofErr w:type="gramStart"/>
+      <w:r>
+        <w:t xml:space="preserve">Yet </w:t>
       </w:r>
       <w:r>
-        <w:t xml:space="preserve"> the relation 45-10 is more or less constant.  </w:t>
+        <w:t xml:space="preserve"> the</w:t>
+      </w:r>
+      <w:proofErr w:type="gramEnd"/>
+      <w:r>
+        <w:t xml:space="preserve"> relation 45-10 is </w:t>
+      </w:r>
+      <w:proofErr w:type="gramStart"/>
+      <w:r>
+        <w:t>more or less constant</w:t>
+      </w:r>
+      <w:proofErr w:type="gramEnd"/>
+      <w:r>
+        <w:t xml:space="preserve">.  </w:t>
       </w:r>
     </w:p>
     <w:p>
@@ -1233,11 +1464,19 @@
                 <w:lang w:val="en-US"/>
               </w:rPr>
             </w:pPr>
-            <w:r>
-              <w:rPr>
-                <w:lang w:val="en-US"/>
-              </w:rPr>
-              <w:t>how many wells are there?</w:t>
+            <w:proofErr w:type="gramStart"/>
+            <w:r>
+              <w:rPr>
+                <w:lang w:val="en-US"/>
+              </w:rPr>
+              <w:t>how</w:t>
+            </w:r>
+            <w:proofErr w:type="gramEnd"/>
+            <w:r>
+              <w:rPr>
+                <w:lang w:val="en-US"/>
+              </w:rPr>
+              <w:t xml:space="preserve"> many wells are there?</w:t>
             </w:r>
           </w:p>
         </w:tc>
@@ -1946,6 +2185,7 @@
               </w:rPr>
             </w:pPr>
             <w:proofErr w:type="spellStart"/>
+            <w:proofErr w:type="gramStart"/>
             <w:r>
               <w:rPr>
                 <w:lang w:val="en-US"/>
@@ -1953,6 +2193,7 @@
               <w:t>whats</w:t>
             </w:r>
             <w:proofErr w:type="spellEnd"/>
+            <w:proofErr w:type="gramEnd"/>
             <w:r>
               <w:rPr>
                 <w:lang w:val="en-US"/>
@@ -3246,7 +3487,6 @@
               <v:path gradientshapeok="t" o:connecttype="rect"/>
             </v:shapetype>
             <v:shape id="Text Box 2" o:spid="_x0000_s1026" type="#_x0000_t202" alt="SLB-Private" style="position:absolute;margin-left:0;margin-top:0;width:49.95pt;height:29pt;z-index:251659264;visibility:visible;mso-wrap-style:none;mso-wrap-distance-left:0;mso-wrap-distance-top:0;mso-wrap-distance-right:0;mso-wrap-distance-bottom:0;mso-position-horizontal:center;mso-position-horizontal-relative:page;mso-position-vertical:bottom;mso-position-vertical-relative:page;v-text-anchor:bottom" o:gfxdata="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" filled="f" stroked="f">
-              <v:fill o:detectmouseclick="t"/>
               <v:textbox style="mso-fit-shape-to-text:t" inset="0,0,0,15pt">
                 <w:txbxContent>
                   <w:p>
@@ -3375,7 +3615,6 @@
               <v:path gradientshapeok="t" o:connecttype="rect"/>
             </v:shapetype>
             <v:shape id="Text Box 3" o:spid="_x0000_s1027" type="#_x0000_t202" alt="SLB-Private" style="position:absolute;margin-left:0;margin-top:0;width:49.95pt;height:29pt;z-index:251660288;visibility:visible;mso-wrap-style:none;mso-wrap-distance-left:0;mso-wrap-distance-top:0;mso-wrap-distance-right:0;mso-wrap-distance-bottom:0;mso-position-horizontal:center;mso-position-horizontal-relative:page;mso-position-vertical:bottom;mso-position-vertical-relative:page;v-text-anchor:bottom" o:gfxdata="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" filled="f" stroked="f">
-              <v:fill o:detectmouseclick="t"/>
               <v:textbox style="mso-fit-shape-to-text:t" inset="0,0,0,15pt">
                 <w:txbxContent>
                   <w:p>
@@ -3504,7 +3743,6 @@
               <v:path gradientshapeok="t" o:connecttype="rect"/>
             </v:shapetype>
             <v:shape id="Text Box 1" o:spid="_x0000_s1028" type="#_x0000_t202" alt="SLB-Private" style="position:absolute;margin-left:0;margin-top:0;width:49.95pt;height:29pt;z-index:251658240;visibility:visible;mso-wrap-style:none;mso-wrap-distance-left:0;mso-wrap-distance-top:0;mso-wrap-distance-right:0;mso-wrap-distance-bottom:0;mso-position-horizontal:center;mso-position-horizontal-relative:page;mso-position-vertical:bottom;mso-position-vertical-relative:page;v-text-anchor:bottom" o:gfxdata="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" filled="f" stroked="f">
-              <v:fill o:detectmouseclick="t"/>
               <v:textbox style="mso-fit-shape-to-text:t" inset="0,0,0,15pt">
                 <w:txbxContent>
                   <w:p>
@@ -3685,12 +3923,279 @@
     <w:numStyleLink w:val="HeadingNumList"/>
   </w:abstractNum>
   <w:abstractNum w:abstractNumId="7" w15:restartNumberingAfterBreak="0">
+    <w:nsid w:val="049751E4"/>
+    <w:multiLevelType w:val="hybridMultilevel"/>
+    <w:tmpl w:val="8EA6FA30"/>
+    <w:lvl w:ilvl="0" w:tplc="0809000F">
+      <w:start w:val="1"/>
+      <w:numFmt w:val="decimal"/>
+      <w:lvlText w:val="%1."/>
+      <w:lvlJc w:val="left"/>
+      <w:pPr>
+        <w:ind w:left="720" w:hanging="360"/>
+      </w:pPr>
+      <w:rPr>
+        <w:rFonts w:hint="default"/>
+      </w:rPr>
+    </w:lvl>
+    <w:lvl w:ilvl="1" w:tplc="08090019" w:tentative="1">
+      <w:start w:val="1"/>
+      <w:numFmt w:val="lowerLetter"/>
+      <w:lvlText w:val="%2."/>
+      <w:lvlJc w:val="left"/>
+      <w:pPr>
+        <w:ind w:left="1440" w:hanging="360"/>
+      </w:pPr>
+    </w:lvl>
+    <w:lvl w:ilvl="2" w:tplc="0809001B" w:tentative="1">
+      <w:start w:val="1"/>
+      <w:numFmt w:val="lowerRoman"/>
+      <w:lvlText w:val="%3."/>
+      <w:lvlJc w:val="right"/>
+      <w:pPr>
+        <w:ind w:left="2160" w:hanging="180"/>
+      </w:pPr>
+    </w:lvl>
+    <w:lvl w:ilvl="3" w:tplc="0809000F" w:tentative="1">
+      <w:start w:val="1"/>
+      <w:numFmt w:val="decimal"/>
+      <w:lvlText w:val="%4."/>
+      <w:lvlJc w:val="left"/>
+      <w:pPr>
+        <w:ind w:left="2880" w:hanging="360"/>
+      </w:pPr>
+    </w:lvl>
+    <w:lvl w:ilvl="4" w:tplc="08090019" w:tentative="1">
+      <w:start w:val="1"/>
+      <w:numFmt w:val="lowerLetter"/>
+      <w:lvlText w:val="%5."/>
+      <w:lvlJc w:val="left"/>
+      <w:pPr>
+        <w:ind w:left="3600" w:hanging="360"/>
+      </w:pPr>
+    </w:lvl>
+    <w:lvl w:ilvl="5" w:tplc="0809001B" w:tentative="1">
+      <w:start w:val="1"/>
+      <w:numFmt w:val="lowerRoman"/>
+      <w:lvlText w:val="%6."/>
+      <w:lvlJc w:val="right"/>
+      <w:pPr>
+        <w:ind w:left="4320" w:hanging="180"/>
+      </w:pPr>
+    </w:lvl>
+    <w:lvl w:ilvl="6" w:tplc="0809000F" w:tentative="1">
+      <w:start w:val="1"/>
+      <w:numFmt w:val="decimal"/>
+      <w:lvlText w:val="%7."/>
+      <w:lvlJc w:val="left"/>
+      <w:pPr>
+        <w:ind w:left="5040" w:hanging="360"/>
+      </w:pPr>
+    </w:lvl>
+    <w:lvl w:ilvl="7" w:tplc="08090019" w:tentative="1">
+      <w:start w:val="1"/>
+      <w:numFmt w:val="lowerLetter"/>
+      <w:lvlText w:val="%8."/>
+      <w:lvlJc w:val="left"/>
+      <w:pPr>
+        <w:ind w:left="5760" w:hanging="360"/>
+      </w:pPr>
+    </w:lvl>
+    <w:lvl w:ilvl="8" w:tplc="0809001B" w:tentative="1">
+      <w:start w:val="1"/>
+      <w:numFmt w:val="lowerRoman"/>
+      <w:lvlText w:val="%9."/>
+      <w:lvlJc w:val="right"/>
+      <w:pPr>
+        <w:ind w:left="6480" w:hanging="180"/>
+      </w:pPr>
+    </w:lvl>
+  </w:abstractNum>
+  <w:abstractNum w:abstractNumId="8" w15:restartNumberingAfterBreak="0">
+    <w:nsid w:val="0F9A4875"/>
+    <w:multiLevelType w:val="hybridMultilevel"/>
+    <w:tmpl w:val="9EBE6F7E"/>
+    <w:lvl w:ilvl="0" w:tplc="0809000F">
+      <w:start w:val="1"/>
+      <w:numFmt w:val="decimal"/>
+      <w:lvlText w:val="%1."/>
+      <w:lvlJc w:val="left"/>
+      <w:pPr>
+        <w:ind w:left="720" w:hanging="360"/>
+      </w:pPr>
+      <w:rPr>
+        <w:rFonts w:hint="default"/>
+      </w:rPr>
+    </w:lvl>
+    <w:lvl w:ilvl="1" w:tplc="08090019" w:tentative="1">
+      <w:start w:val="1"/>
+      <w:numFmt w:val="lowerLetter"/>
+      <w:lvlText w:val="%2."/>
+      <w:lvlJc w:val="left"/>
+      <w:pPr>
+        <w:ind w:left="1440" w:hanging="360"/>
+      </w:pPr>
+    </w:lvl>
+    <w:lvl w:ilvl="2" w:tplc="0809001B" w:tentative="1">
+      <w:start w:val="1"/>
+      <w:numFmt w:val="lowerRoman"/>
+      <w:lvlText w:val="%3."/>
+      <w:lvlJc w:val="right"/>
+      <w:pPr>
+        <w:ind w:left="2160" w:hanging="180"/>
+      </w:pPr>
+    </w:lvl>
+    <w:lvl w:ilvl="3" w:tplc="0809000F" w:tentative="1">
+      <w:start w:val="1"/>
+      <w:numFmt w:val="decimal"/>
+      <w:lvlText w:val="%4."/>
+      <w:lvlJc w:val="left"/>
+      <w:pPr>
+        <w:ind w:left="2880" w:hanging="360"/>
+      </w:pPr>
+    </w:lvl>
+    <w:lvl w:ilvl="4" w:tplc="08090019" w:tentative="1">
+      <w:start w:val="1"/>
+      <w:numFmt w:val="lowerLetter"/>
+      <w:lvlText w:val="%5."/>
+      <w:lvlJc w:val="left"/>
+      <w:pPr>
+        <w:ind w:left="3600" w:hanging="360"/>
+      </w:pPr>
+    </w:lvl>
+    <w:lvl w:ilvl="5" w:tplc="0809001B" w:tentative="1">
+      <w:start w:val="1"/>
+      <w:numFmt w:val="lowerRoman"/>
+      <w:lvlText w:val="%6."/>
+      <w:lvlJc w:val="right"/>
+      <w:pPr>
+        <w:ind w:left="4320" w:hanging="180"/>
+      </w:pPr>
+    </w:lvl>
+    <w:lvl w:ilvl="6" w:tplc="0809000F" w:tentative="1">
+      <w:start w:val="1"/>
+      <w:numFmt w:val="decimal"/>
+      <w:lvlText w:val="%7."/>
+      <w:lvlJc w:val="left"/>
+      <w:pPr>
+        <w:ind w:left="5040" w:hanging="360"/>
+      </w:pPr>
+    </w:lvl>
+    <w:lvl w:ilvl="7" w:tplc="08090019" w:tentative="1">
+      <w:start w:val="1"/>
+      <w:numFmt w:val="lowerLetter"/>
+      <w:lvlText w:val="%8."/>
+      <w:lvlJc w:val="left"/>
+      <w:pPr>
+        <w:ind w:left="5760" w:hanging="360"/>
+      </w:pPr>
+    </w:lvl>
+    <w:lvl w:ilvl="8" w:tplc="0809001B" w:tentative="1">
+      <w:start w:val="1"/>
+      <w:numFmt w:val="lowerRoman"/>
+      <w:lvlText w:val="%9."/>
+      <w:lvlJc w:val="right"/>
+      <w:pPr>
+        <w:ind w:left="6480" w:hanging="180"/>
+      </w:pPr>
+    </w:lvl>
+  </w:abstractNum>
+  <w:abstractNum w:abstractNumId="9" w15:restartNumberingAfterBreak="0">
+    <w:nsid w:val="104C6D16"/>
+    <w:multiLevelType w:val="hybridMultilevel"/>
+    <w:tmpl w:val="5C3AB458"/>
+    <w:lvl w:ilvl="0" w:tplc="0809000F">
+      <w:start w:val="1"/>
+      <w:numFmt w:val="decimal"/>
+      <w:lvlText w:val="%1."/>
+      <w:lvlJc w:val="left"/>
+      <w:pPr>
+        <w:ind w:left="720" w:hanging="360"/>
+      </w:pPr>
+      <w:rPr>
+        <w:rFonts w:hint="default"/>
+      </w:rPr>
+    </w:lvl>
+    <w:lvl w:ilvl="1" w:tplc="08090019" w:tentative="1">
+      <w:start w:val="1"/>
+      <w:numFmt w:val="lowerLetter"/>
+      <w:lvlText w:val="%2."/>
+      <w:lvlJc w:val="left"/>
+      <w:pPr>
+        <w:ind w:left="1440" w:hanging="360"/>
+      </w:pPr>
+    </w:lvl>
+    <w:lvl w:ilvl="2" w:tplc="0809001B" w:tentative="1">
+      <w:start w:val="1"/>
+      <w:numFmt w:val="lowerRoman"/>
+      <w:lvlText w:val="%3."/>
+      <w:lvlJc w:val="right"/>
+      <w:pPr>
+        <w:ind w:left="2160" w:hanging="180"/>
+      </w:pPr>
+    </w:lvl>
+    <w:lvl w:ilvl="3" w:tplc="0809000F" w:tentative="1">
+      <w:start w:val="1"/>
+      <w:numFmt w:val="decimal"/>
+      <w:lvlText w:val="%4."/>
+      <w:lvlJc w:val="left"/>
+      <w:pPr>
+        <w:ind w:left="2880" w:hanging="360"/>
+      </w:pPr>
+    </w:lvl>
+    <w:lvl w:ilvl="4" w:tplc="08090019" w:tentative="1">
+      <w:start w:val="1"/>
+      <w:numFmt w:val="lowerLetter"/>
+      <w:lvlText w:val="%5."/>
+      <w:lvlJc w:val="left"/>
+      <w:pPr>
+        <w:ind w:left="3600" w:hanging="360"/>
+      </w:pPr>
+    </w:lvl>
+    <w:lvl w:ilvl="5" w:tplc="0809001B" w:tentative="1">
+      <w:start w:val="1"/>
+      <w:numFmt w:val="lowerRoman"/>
+      <w:lvlText w:val="%6."/>
+      <w:lvlJc w:val="right"/>
+      <w:pPr>
+        <w:ind w:left="4320" w:hanging="180"/>
+      </w:pPr>
+    </w:lvl>
+    <w:lvl w:ilvl="6" w:tplc="0809000F" w:tentative="1">
+      <w:start w:val="1"/>
+      <w:numFmt w:val="decimal"/>
+      <w:lvlText w:val="%7."/>
+      <w:lvlJc w:val="left"/>
+      <w:pPr>
+        <w:ind w:left="5040" w:hanging="360"/>
+      </w:pPr>
+    </w:lvl>
+    <w:lvl w:ilvl="7" w:tplc="08090019" w:tentative="1">
+      <w:start w:val="1"/>
+      <w:numFmt w:val="lowerLetter"/>
+      <w:lvlText w:val="%8."/>
+      <w:lvlJc w:val="left"/>
+      <w:pPr>
+        <w:ind w:left="5760" w:hanging="360"/>
+      </w:pPr>
+    </w:lvl>
+    <w:lvl w:ilvl="8" w:tplc="0809001B" w:tentative="1">
+      <w:start w:val="1"/>
+      <w:numFmt w:val="lowerRoman"/>
+      <w:lvlText w:val="%9."/>
+      <w:lvlJc w:val="right"/>
+      <w:pPr>
+        <w:ind w:left="6480" w:hanging="180"/>
+      </w:pPr>
+    </w:lvl>
+  </w:abstractNum>
+  <w:abstractNum w:abstractNumId="10" w15:restartNumberingAfterBreak="0">
     <w:nsid w:val="10C92DE1"/>
     <w:multiLevelType w:val="multilevel"/>
     <w:tmpl w:val="B88C6228"/>
     <w:numStyleLink w:val="NumList"/>
   </w:abstractNum>
-  <w:abstractNum w:abstractNumId="8" w15:restartNumberingAfterBreak="0">
+  <w:abstractNum w:abstractNumId="11" w15:restartNumberingAfterBreak="0">
     <w:nsid w:val="13B0789C"/>
     <w:multiLevelType w:val="multilevel"/>
     <w:tmpl w:val="A43C4202"/>
@@ -3813,7 +4318,7 @@
       </w:rPr>
     </w:lvl>
   </w:abstractNum>
-  <w:abstractNum w:abstractNumId="9" w15:restartNumberingAfterBreak="0">
+  <w:abstractNum w:abstractNumId="12" w15:restartNumberingAfterBreak="0">
     <w:nsid w:val="3AA87344"/>
     <w:multiLevelType w:val="multilevel"/>
     <w:tmpl w:val="D4287C60"/>
@@ -3927,7 +4432,7 @@
       </w:rPr>
     </w:lvl>
   </w:abstractNum>
-  <w:abstractNum w:abstractNumId="10" w15:restartNumberingAfterBreak="0">
+  <w:abstractNum w:abstractNumId="13" w15:restartNumberingAfterBreak="0">
     <w:nsid w:val="46D22968"/>
     <w:multiLevelType w:val="multilevel"/>
     <w:tmpl w:val="B88C6228"/>
@@ -4063,22 +4568,22 @@
     <w:abstractNumId w:val="0"/>
   </w:num>
   <w:num w:numId="7" w16cid:durableId="1574899723">
-    <w:abstractNumId w:val="10"/>
+    <w:abstractNumId w:val="13"/>
   </w:num>
   <w:num w:numId="8" w16cid:durableId="554775974">
-    <w:abstractNumId w:val="9"/>
+    <w:abstractNumId w:val="12"/>
   </w:num>
   <w:num w:numId="9" w16cid:durableId="574555077">
     <w:abstractNumId w:val="6"/>
   </w:num>
   <w:num w:numId="10" w16cid:durableId="713700014">
-    <w:abstractNumId w:val="7"/>
+    <w:abstractNumId w:val="10"/>
   </w:num>
   <w:num w:numId="11" w16cid:durableId="655383151">
     <w:abstractNumId w:val="5"/>
   </w:num>
   <w:num w:numId="12" w16cid:durableId="559054489">
-    <w:abstractNumId w:val="7"/>
+    <w:abstractNumId w:val="10"/>
   </w:num>
   <w:num w:numId="13" w16cid:durableId="2056078209">
     <w:abstractNumId w:val="3"/>
@@ -4087,18 +4592,27 @@
     <w:abstractNumId w:val="2"/>
   </w:num>
   <w:num w:numId="15" w16cid:durableId="1581449739">
+    <w:abstractNumId w:val="10"/>
+  </w:num>
+  <w:num w:numId="16" w16cid:durableId="1072657298">
+    <w:abstractNumId w:val="10"/>
+  </w:num>
+  <w:num w:numId="17" w16cid:durableId="726606638">
+    <w:abstractNumId w:val="13"/>
+  </w:num>
+  <w:num w:numId="18" w16cid:durableId="1119833186">
+    <w:abstractNumId w:val="12"/>
+  </w:num>
+  <w:num w:numId="19" w16cid:durableId="157768813">
+    <w:abstractNumId w:val="11"/>
+  </w:num>
+  <w:num w:numId="20" w16cid:durableId="139659909">
     <w:abstractNumId w:val="7"/>
   </w:num>
-  <w:num w:numId="16" w16cid:durableId="1072657298">
-    <w:abstractNumId w:val="7"/>
-  </w:num>
-  <w:num w:numId="17" w16cid:durableId="726606638">
-    <w:abstractNumId w:val="10"/>
-  </w:num>
-  <w:num w:numId="18" w16cid:durableId="1119833186">
+  <w:num w:numId="21" w16cid:durableId="1495142848">
     <w:abstractNumId w:val="9"/>
   </w:num>
-  <w:num w:numId="19" w16cid:durableId="157768813">
+  <w:num w:numId="22" w16cid:durableId="1131048155">
     <w:abstractNumId w:val="8"/>
   </w:num>
 </w:numbering>
@@ -5629,13 +6143,12 @@
 </file>
 
 <file path=customXml/item1.xml><?xml version="1.0" encoding="utf-8"?>
-<p:properties xmlns:p="http://schemas.microsoft.com/office/2006/metadata/properties" xmlns:xsi="http://www.w3.org/2001/XMLSchema-instance" xmlns:pc="http://schemas.microsoft.com/office/infopath/2007/PartnerControls">
-  <documentManagement>
-    <lcf76f155ced4ddcb4097134ff3c332f xmlns="f8393d0d-bc01-41cc-80e2-d7458440135e">
-      <Terms xmlns="http://schemas.microsoft.com/office/infopath/2007/PartnerControls"/>
-    </lcf76f155ced4ddcb4097134ff3c332f>
-  </documentManagement>
-</p:properties>
+<?mso-contentType ?>
+<FormTemplates xmlns="http://schemas.microsoft.com/sharepoint/v3/contenttype/forms">
+  <Display>DocumentLibraryForm</Display>
+  <Edit>DocumentLibraryForm</Edit>
+  <New>DocumentLibraryForm</New>
+</FormTemplates>
 </file>
 
 <file path=customXml/item2.xml><?xml version="1.0" encoding="utf-8"?>
@@ -5805,12 +6318,13 @@
 </file>
 
 <file path=customXml/item3.xml><?xml version="1.0" encoding="utf-8"?>
-<?mso-contentType ?>
-<FormTemplates xmlns="http://schemas.microsoft.com/sharepoint/v3/contenttype/forms">
-  <Display>DocumentLibraryForm</Display>
-  <Edit>DocumentLibraryForm</Edit>
-  <New>DocumentLibraryForm</New>
-</FormTemplates>
+<p:properties xmlns:p="http://schemas.microsoft.com/office/2006/metadata/properties" xmlns:xsi="http://www.w3.org/2001/XMLSchema-instance" xmlns:pc="http://schemas.microsoft.com/office/infopath/2007/PartnerControls">
+  <documentManagement>
+    <lcf76f155ced4ddcb4097134ff3c332f xmlns="f8393d0d-bc01-41cc-80e2-d7458440135e">
+      <Terms xmlns="http://schemas.microsoft.com/office/infopath/2007/PartnerControls"/>
+    </lcf76f155ced4ddcb4097134ff3c332f>
+  </documentManagement>
+</p:properties>
 </file>
 
 <file path=customXml/item4.xml><?xml version="1.0" encoding="utf-8"?>
@@ -5818,11 +6332,9 @@
 </file>
 
 <file path=customXml/itemProps1.xml><?xml version="1.0" encoding="utf-8"?>
-<ds:datastoreItem xmlns:ds="http://schemas.openxmlformats.org/officeDocument/2006/customXml" ds:itemID="{305CD977-AB85-4DFE-8BD6-46D1BFD0F0ED}">
+<ds:datastoreItem xmlns:ds="http://schemas.openxmlformats.org/officeDocument/2006/customXml" ds:itemID="{6BD10697-D754-4B0F-9ACE-82CAE11369FB}">
   <ds:schemaRefs>
-    <ds:schemaRef ds:uri="http://schemas.microsoft.com/office/2006/metadata/properties"/>
-    <ds:schemaRef ds:uri="http://schemas.microsoft.com/office/infopath/2007/PartnerControls"/>
-    <ds:schemaRef ds:uri="f8393d0d-bc01-41cc-80e2-d7458440135e"/>
+    <ds:schemaRef ds:uri="http://schemas.microsoft.com/sharepoint/v3/contenttype/forms"/>
   </ds:schemaRefs>
 </ds:datastoreItem>
 </file>
@@ -5846,9 +6358,11 @@
 </file>
 
 <file path=customXml/itemProps3.xml><?xml version="1.0" encoding="utf-8"?>
-<ds:datastoreItem xmlns:ds="http://schemas.openxmlformats.org/officeDocument/2006/customXml" ds:itemID="{6BD10697-D754-4B0F-9ACE-82CAE11369FB}">
+<ds:datastoreItem xmlns:ds="http://schemas.openxmlformats.org/officeDocument/2006/customXml" ds:itemID="{305CD977-AB85-4DFE-8BD6-46D1BFD0F0ED}">
   <ds:schemaRefs>
-    <ds:schemaRef ds:uri="http://schemas.microsoft.com/sharepoint/v3/contenttype/forms"/>
+    <ds:schemaRef ds:uri="http://schemas.microsoft.com/office/2006/metadata/properties"/>
+    <ds:schemaRef ds:uri="http://schemas.microsoft.com/office/infopath/2007/PartnerControls"/>
+    <ds:schemaRef ds:uri="f8393d0d-bc01-41cc-80e2-d7458440135e"/>
   </ds:schemaRefs>
 </ds:datastoreItem>
 </file>

</xml_diff>

<commit_message>
Added the planner with a few test prompts and golden tests
</commit_message>
<xml_diff>
--- a/AnalystAgentForTS.docx
+++ b/AnalystAgentForTS.docx
@@ -3355,11 +3355,220 @@
         <w:t xml:space="preserve"> </w:t>
       </w:r>
     </w:p>
+    <w:p>
+      <w:r>
+        <w:t>Planner step</w:t>
+      </w:r>
+    </w:p>
+    <w:p/>
+    <w:p/>
+    <w:p/>
+    <w:p/>
+    <w:p/>
+    <w:p/>
+    <w:p/>
+    <w:p>
+      <w:pPr>
+        <w:rPr>
+          <w:b/>
+          <w:bCs/>
+          <w:color w:val="0014DC" w:themeColor="accent1"/>
+          <w:sz w:val="28"/>
+          <w:szCs w:val="28"/>
+        </w:rPr>
+      </w:pPr>
+    </w:p>
+    <w:p>
+      <w:pPr>
+        <w:rPr>
+          <w:b/>
+          <w:bCs/>
+          <w:color w:val="0014DC" w:themeColor="accent1"/>
+          <w:sz w:val="28"/>
+          <w:szCs w:val="28"/>
+        </w:rPr>
+      </w:pPr>
+      <w:r>
+        <w:rPr>
+          <w:b/>
+          <w:bCs/>
+          <w:color w:val="0014DC" w:themeColor="accent1"/>
+          <w:sz w:val="28"/>
+          <w:szCs w:val="28"/>
+        </w:rPr>
+        <w:t>Golden queries tests</w:t>
+      </w:r>
+      <w:r>
+        <w:rPr>
+          <w:b/>
+          <w:bCs/>
+          <w:color w:val="0014DC" w:themeColor="accent1"/>
+          <w:sz w:val="28"/>
+          <w:szCs w:val="28"/>
+        </w:rPr>
+        <w:t xml:space="preserve"> for the planner </w:t>
+      </w:r>
+    </w:p>
+    <w:p>
+      <w:r>
+        <w:drawing>
+          <wp:inline distT="0" distB="0" distL="0" distR="0" wp14:anchorId="02BFE5BA" wp14:editId="417CC63A">
+            <wp:extent cx="6216650" cy="3564890"/>
+            <wp:effectExtent l="19050" t="19050" r="12700" b="16510"/>
+            <wp:docPr id="2062472885" name="Picture 1"/>
+            <wp:cNvGraphicFramePr>
+              <a:graphicFrameLocks xmlns:a="http://schemas.openxmlformats.org/drawingml/2006/main" noChangeAspect="1"/>
+            </wp:cNvGraphicFramePr>
+            <a:graphic xmlns:a="http://schemas.openxmlformats.org/drawingml/2006/main">
+              <a:graphicData uri="http://schemas.openxmlformats.org/drawingml/2006/picture">
+                <pic:pic xmlns:pic="http://schemas.openxmlformats.org/drawingml/2006/picture">
+                  <pic:nvPicPr>
+                    <pic:cNvPr id="2062472885" name=""/>
+                    <pic:cNvPicPr/>
+                  </pic:nvPicPr>
+                  <pic:blipFill>
+                    <a:blip r:embed="rId12"/>
+                    <a:stretch>
+                      <a:fillRect/>
+                    </a:stretch>
+                  </pic:blipFill>
+                  <pic:spPr>
+                    <a:xfrm>
+                      <a:off x="0" y="0"/>
+                      <a:ext cx="6216650" cy="3564890"/>
+                    </a:xfrm>
+                    <a:prstGeom prst="rect">
+                      <a:avLst/>
+                    </a:prstGeom>
+                    <a:ln>
+                      <a:solidFill>
+                        <a:schemeClr val="tx2">
+                          <a:lumMod val="40000"/>
+                          <a:lumOff val="60000"/>
+                        </a:schemeClr>
+                      </a:solidFill>
+                    </a:ln>
+                  </pic:spPr>
+                </pic:pic>
+              </a:graphicData>
+            </a:graphic>
+          </wp:inline>
+        </w:drawing>
+      </w:r>
+    </w:p>
+    <w:p/>
+    <w:p>
+      <w:pPr>
+        <w:rPr>
+          <w:b/>
+          <w:bCs/>
+          <w:color w:val="0014DC" w:themeColor="accent1"/>
+          <w:sz w:val="28"/>
+          <w:szCs w:val="28"/>
+        </w:rPr>
+      </w:pPr>
+      <w:r>
+        <w:rPr>
+          <w:b/>
+          <w:bCs/>
+          <w:color w:val="0014DC" w:themeColor="accent1"/>
+          <w:sz w:val="28"/>
+          <w:szCs w:val="28"/>
+        </w:rPr>
+        <w:t>Golden queries tests</w:t>
+      </w:r>
+      <w:r>
+        <w:rPr>
+          <w:b/>
+          <w:bCs/>
+          <w:color w:val="0014DC" w:themeColor="accent1"/>
+          <w:sz w:val="28"/>
+          <w:szCs w:val="28"/>
+        </w:rPr>
+        <w:t xml:space="preserve"> for the </w:t>
+      </w:r>
+      <w:r>
+        <w:rPr>
+          <w:b/>
+          <w:bCs/>
+          <w:color w:val="0014DC" w:themeColor="accent1"/>
+          <w:sz w:val="28"/>
+          <w:szCs w:val="28"/>
+        </w:rPr>
+        <w:t xml:space="preserve">analyst </w:t>
+      </w:r>
+      <w:r>
+        <w:rPr>
+          <w:b/>
+          <w:bCs/>
+          <w:color w:val="0014DC" w:themeColor="accent1"/>
+          <w:sz w:val="28"/>
+          <w:szCs w:val="28"/>
+        </w:rPr>
+        <w:t xml:space="preserve"> </w:t>
+      </w:r>
+    </w:p>
+    <w:p/>
+    <w:p/>
+    <w:p>
+      <w:pPr>
+        <w:rPr>
+          <w:b/>
+          <w:bCs/>
+          <w:color w:val="0014DC" w:themeColor="accent1"/>
+          <w:sz w:val="28"/>
+          <w:szCs w:val="28"/>
+        </w:rPr>
+      </w:pPr>
+      <w:r>
+        <w:rPr>
+          <w:b/>
+          <w:bCs/>
+          <w:color w:val="0014DC" w:themeColor="accent1"/>
+          <w:sz w:val="28"/>
+          <w:szCs w:val="28"/>
+        </w:rPr>
+        <w:t xml:space="preserve">Integration tests for the agents </w:t>
+      </w:r>
+    </w:p>
+    <w:p/>
+    <w:p/>
+    <w:p>
+      <w:pPr>
+        <w:rPr>
+          <w:b/>
+          <w:bCs/>
+          <w:color w:val="0014DC" w:themeColor="accent1"/>
+          <w:sz w:val="28"/>
+          <w:szCs w:val="28"/>
+        </w:rPr>
+      </w:pPr>
+      <w:r>
+        <w:rPr>
+          <w:b/>
+          <w:bCs/>
+          <w:color w:val="0014DC" w:themeColor="accent1"/>
+          <w:sz w:val="28"/>
+          <w:szCs w:val="28"/>
+        </w:rPr>
+        <w:t xml:space="preserve">Integration tests </w:t>
+      </w:r>
+      <w:r>
+        <w:rPr>
+          <w:b/>
+          <w:bCs/>
+          <w:color w:val="0014DC" w:themeColor="accent1"/>
+          <w:sz w:val="28"/>
+          <w:szCs w:val="28"/>
+        </w:rPr>
+        <w:t>in the Web application</w:t>
+      </w:r>
+    </w:p>
     <w:p/>
     <w:sectPr>
-      <w:footerReference w:type="even" r:id="rId12"/>
-      <w:footerReference w:type="default" r:id="rId13"/>
-      <w:footerReference w:type="first" r:id="rId14"/>
+      <w:footerReference w:type="even" r:id="rId13"/>
+      <w:footerReference w:type="default" r:id="rId14"/>
+      <w:footerReference w:type="first" r:id="rId15"/>
       <w:pgSz w:w="12240" w:h="15840" w:code="1"/>
       <w:pgMar w:top="1225" w:right="1225" w:bottom="1225" w:left="1225" w:header="567" w:footer="567" w:gutter="0"/>
       <w:cols w:space="708"/>
@@ -5206,7 +5415,6 @@
   <w:style w:type="character" w:default="1" w:styleId="DefaultParagraphFont">
     <w:name w:val="Default Paragraph Font"/>
     <w:uiPriority w:val="1"/>
-    <w:semiHidden/>
     <w:unhideWhenUsed/>
   </w:style>
   <w:style w:type="table" w:default="1" w:styleId="TableNormal">
@@ -6143,12 +6351,13 @@
 </file>
 
 <file path=customXml/item1.xml><?xml version="1.0" encoding="utf-8"?>
-<?mso-contentType ?>
-<FormTemplates xmlns="http://schemas.microsoft.com/sharepoint/v3/contenttype/forms">
-  <Display>DocumentLibraryForm</Display>
-  <Edit>DocumentLibraryForm</Edit>
-  <New>DocumentLibraryForm</New>
-</FormTemplates>
+<p:properties xmlns:p="http://schemas.microsoft.com/office/2006/metadata/properties" xmlns:xsi="http://www.w3.org/2001/XMLSchema-instance" xmlns:pc="http://schemas.microsoft.com/office/infopath/2007/PartnerControls">
+  <documentManagement>
+    <lcf76f155ced4ddcb4097134ff3c332f xmlns="f8393d0d-bc01-41cc-80e2-d7458440135e">
+      <Terms xmlns="http://schemas.microsoft.com/office/infopath/2007/PartnerControls"/>
+    </lcf76f155ced4ddcb4097134ff3c332f>
+  </documentManagement>
+</p:properties>
 </file>
 
 <file path=customXml/item2.xml><?xml version="1.0" encoding="utf-8"?>
@@ -6318,13 +6527,12 @@
 </file>
 
 <file path=customXml/item3.xml><?xml version="1.0" encoding="utf-8"?>
-<p:properties xmlns:p="http://schemas.microsoft.com/office/2006/metadata/properties" xmlns:xsi="http://www.w3.org/2001/XMLSchema-instance" xmlns:pc="http://schemas.microsoft.com/office/infopath/2007/PartnerControls">
-  <documentManagement>
-    <lcf76f155ced4ddcb4097134ff3c332f xmlns="f8393d0d-bc01-41cc-80e2-d7458440135e">
-      <Terms xmlns="http://schemas.microsoft.com/office/infopath/2007/PartnerControls"/>
-    </lcf76f155ced4ddcb4097134ff3c332f>
-  </documentManagement>
-</p:properties>
+<?mso-contentType ?>
+<FormTemplates xmlns="http://schemas.microsoft.com/sharepoint/v3/contenttype/forms">
+  <Display>DocumentLibraryForm</Display>
+  <Edit>DocumentLibraryForm</Edit>
+  <New>DocumentLibraryForm</New>
+</FormTemplates>
 </file>
 
 <file path=customXml/item4.xml><?xml version="1.0" encoding="utf-8"?>
@@ -6332,9 +6540,11 @@
 </file>
 
 <file path=customXml/itemProps1.xml><?xml version="1.0" encoding="utf-8"?>
-<ds:datastoreItem xmlns:ds="http://schemas.openxmlformats.org/officeDocument/2006/customXml" ds:itemID="{6BD10697-D754-4B0F-9ACE-82CAE11369FB}">
+<ds:datastoreItem xmlns:ds="http://schemas.openxmlformats.org/officeDocument/2006/customXml" ds:itemID="{305CD977-AB85-4DFE-8BD6-46D1BFD0F0ED}">
   <ds:schemaRefs>
-    <ds:schemaRef ds:uri="http://schemas.microsoft.com/sharepoint/v3/contenttype/forms"/>
+    <ds:schemaRef ds:uri="http://schemas.microsoft.com/office/2006/metadata/properties"/>
+    <ds:schemaRef ds:uri="http://schemas.microsoft.com/office/infopath/2007/PartnerControls"/>
+    <ds:schemaRef ds:uri="f8393d0d-bc01-41cc-80e2-d7458440135e"/>
   </ds:schemaRefs>
 </ds:datastoreItem>
 </file>
@@ -6358,11 +6568,9 @@
 </file>
 
 <file path=customXml/itemProps3.xml><?xml version="1.0" encoding="utf-8"?>
-<ds:datastoreItem xmlns:ds="http://schemas.openxmlformats.org/officeDocument/2006/customXml" ds:itemID="{305CD977-AB85-4DFE-8BD6-46D1BFD0F0ED}">
+<ds:datastoreItem xmlns:ds="http://schemas.openxmlformats.org/officeDocument/2006/customXml" ds:itemID="{6BD10697-D754-4B0F-9ACE-82CAE11369FB}">
   <ds:schemaRefs>
-    <ds:schemaRef ds:uri="http://schemas.microsoft.com/office/2006/metadata/properties"/>
-    <ds:schemaRef ds:uri="http://schemas.microsoft.com/office/infopath/2007/PartnerControls"/>
-    <ds:schemaRef ds:uri="f8393d0d-bc01-41cc-80e2-d7458440135e"/>
+    <ds:schemaRef ds:uri="http://schemas.microsoft.com/sharepoint/v3/contenttype/forms"/>
   </ds:schemaRefs>
 </ds:datastoreItem>
 </file>

</xml_diff>